<commit_message>
- react day 3 - update flutter cv
</commit_message>
<xml_diff>
--- a/Yousef Mohamed Flutter CV.docx
+++ b/Yousef Mohamed Flutter CV.docx
@@ -1329,8 +1329,6 @@
         </w:rPr>
         <w:t>published on the Play Store and App Store.</w:t>
       </w:r>
-      <w:bookmarkStart w:id="0" w:name="_GoBack"/>
-      <w:bookmarkEnd w:id="0"/>
     </w:p>
     <w:p>
       <w:pPr>
@@ -1487,7 +1485,19 @@
           <w:szCs w:val="20"/>
           <w:lang w:val="en-US" w:eastAsia="zh-CN" w:bidi="ar-SA"/>
         </w:rPr>
-        <w:t>- Developed an online coaching platform featuring workout plans, nutrition tracking, and secure payment integration.</w:t>
+        <w:t>- Developed an online coaching platform fe</w:t>
+      </w:r>
+      <w:bookmarkStart w:id="0" w:name="_GoBack"/>
+      <w:bookmarkEnd w:id="0"/>
+      <w:r>
+        <w:rPr>
+          <w:rFonts w:hint="default" w:asciiTheme="minorHAnsi" w:hAnsiTheme="minorHAnsi" w:eastAsiaTheme="minorEastAsia" w:cstheme="minorBidi"/>
+          <w:kern w:val="0"/>
+          <w:sz w:val="20"/>
+          <w:szCs w:val="20"/>
+          <w:lang w:val="en-US" w:eastAsia="zh-CN" w:bidi="ar-SA"/>
+        </w:rPr>
+        <w:t>aturing workout plans, nutrition tracking, and secure payment integration.</w:t>
       </w:r>
     </w:p>
     <w:p>
@@ -1497,7 +1507,7 @@
         <w:keepLines w:val="0"/>
         <w:widowControl/>
         <w:suppressLineNumbers w:val="0"/>
-        <w:spacing w:before="0" w:beforeAutospacing="0" w:after="303" w:afterLines="84" w:afterAutospacing="0" w:line="240" w:lineRule="auto"/>
+        <w:spacing w:before="0" w:beforeAutospacing="0" w:after="0" w:afterAutospacing="0" w:line="240" w:lineRule="auto"/>
         <w:rPr>
           <w:rFonts w:hint="default" w:asciiTheme="minorHAnsi" w:hAnsiTheme="minorHAnsi" w:eastAsiaTheme="minorEastAsia" w:cstheme="minorBidi"/>
           <w:kern w:val="0"/>
@@ -1524,68 +1534,216 @@
         <w:keepLines w:val="0"/>
         <w:widowControl/>
         <w:suppressLineNumbers w:val="0"/>
-        <w:spacing w:before="0" w:beforeAutospacing="0" w:after="125" w:afterLines="34" w:afterAutospacing="0" w:line="240" w:lineRule="auto"/>
-        <w:jc w:val="left"/>
-        <w:rPr>
-          <w:rFonts w:hint="default" w:asciiTheme="minorHAnsi" w:hAnsiTheme="minorHAnsi" w:eastAsiaTheme="minorEastAsia" w:cstheme="minorBidi"/>
-          <w:b/>
-          <w:bCs/>
-          <w:kern w:val="0"/>
-          <w:sz w:val="20"/>
-          <w:szCs w:val="20"/>
-          <w:lang w:val="en-US" w:eastAsia="zh-CN" w:bidi="ar-SA"/>
-        </w:rPr>
-      </w:pPr>
-      <w:r>
-        <w:rPr>
-          <w:rFonts w:hint="default" w:asciiTheme="minorHAnsi" w:hAnsiTheme="minorHAnsi" w:eastAsiaTheme="minorEastAsia" w:cstheme="minorBidi"/>
-          <w:b/>
-          <w:bCs/>
-          <w:kern w:val="0"/>
-          <w:sz w:val="20"/>
-          <w:szCs w:val="20"/>
-          <w:lang w:val="en-US" w:eastAsia="zh-CN" w:bidi="ar-SA"/>
-        </w:rPr>
-        <w:t>Hotel Booking</w:t>
-      </w:r>
-      <w:r>
-        <w:rPr>
-          <w:rFonts w:hint="cs" w:asciiTheme="minorHAnsi" w:hAnsiTheme="minorHAnsi" w:eastAsiaTheme="minorEastAsia" w:cstheme="minorBidi"/>
-          <w:b/>
-          <w:bCs/>
-          <w:kern w:val="0"/>
-          <w:sz w:val="20"/>
-          <w:szCs w:val="20"/>
-          <w:rtl/>
-          <w:lang w:val="en-US" w:eastAsia="zh-CN" w:bidi="ar-EG"/>
-        </w:rPr>
-        <w:t xml:space="preserve"> </w:t>
-      </w:r>
-      <w:r>
-        <w:rPr>
-          <w:rFonts w:hint="default" w:ascii="Times New Roman" w:hAnsi="Times New Roman" w:cs="Times New Roman"/>
-          <w:spacing w:val="-7"/>
-          <w:position w:val="1"/>
-          <w:sz w:val="19"/>
-          <w:szCs w:val="19"/>
+        <w:spacing w:before="0" w:beforeAutospacing="0" w:after="0" w:afterAutospacing="0" w:line="240" w:lineRule="auto"/>
+        <w:rPr>
+          <w:rFonts w:hint="default" w:asciiTheme="minorHAnsi" w:hAnsiTheme="minorHAnsi" w:eastAsiaTheme="minorEastAsia" w:cstheme="minorBidi"/>
+          <w:kern w:val="0"/>
+          <w:sz w:val="20"/>
+          <w:szCs w:val="20"/>
+          <w:lang w:val="en-US" w:eastAsia="zh-CN" w:bidi="ar-SA"/>
+        </w:rPr>
+      </w:pPr>
+      <w:r>
+        <w:rPr>
+          <w:rFonts w:hint="default" w:asciiTheme="minorHAnsi" w:hAnsiTheme="minorHAnsi" w:eastAsiaTheme="minorEastAsia" w:cstheme="minorBidi"/>
+          <w:kern w:val="0"/>
+          <w:sz w:val="20"/>
+          <w:szCs w:val="20"/>
+          <w:lang w:val="en-US" w:eastAsia="zh-CN" w:bidi="ar-SA"/>
+        </w:rPr>
+        <w:t xml:space="preserve">- Client Demo: </w:t>
+      </w:r>
+      <w:r>
+        <w:rPr>
+          <w:rFonts w:hint="default" w:asciiTheme="minorHAnsi" w:hAnsiTheme="minorHAnsi" w:eastAsiaTheme="minorEastAsia" w:cstheme="minorBidi"/>
+          <w:kern w:val="0"/>
+          <w:sz w:val="20"/>
+          <w:szCs w:val="20"/>
+          <w:lang w:val="en-US" w:eastAsia="zh-CN" w:bidi="ar-SA"/>
+        </w:rPr>
+        <w:fldChar w:fldCharType="begin"/>
+      </w:r>
+      <w:r>
+        <w:rPr>
+          <w:rFonts w:hint="default" w:asciiTheme="minorHAnsi" w:hAnsiTheme="minorHAnsi" w:eastAsiaTheme="minorEastAsia" w:cstheme="minorBidi"/>
+          <w:kern w:val="0"/>
+          <w:sz w:val="20"/>
+          <w:szCs w:val="20"/>
+          <w:lang w:val="en-US" w:eastAsia="zh-CN" w:bidi="ar-SA"/>
+        </w:rPr>
+        <w:instrText xml:space="preserve"> HYPERLINK "https://drive.google.com/file/d/1FQyEIGfF22ASuhVv1_hRai86LCn2YZxO/view?usp=sharing" </w:instrText>
+      </w:r>
+      <w:r>
+        <w:rPr>
+          <w:rFonts w:hint="default" w:asciiTheme="minorHAnsi" w:hAnsiTheme="minorHAnsi" w:eastAsiaTheme="minorEastAsia" w:cstheme="minorBidi"/>
+          <w:kern w:val="0"/>
+          <w:sz w:val="20"/>
+          <w:szCs w:val="20"/>
+          <w:lang w:val="en-US" w:eastAsia="zh-CN" w:bidi="ar-SA"/>
+        </w:rPr>
+        <w:fldChar w:fldCharType="separate"/>
+      </w:r>
+      <w:r>
+        <w:rPr>
+          <w:rStyle w:val="5"/>
+          <w:rFonts w:hint="default" w:asciiTheme="minorHAnsi" w:hAnsiTheme="minorHAnsi" w:eastAsiaTheme="minorEastAsia" w:cstheme="minorBidi"/>
+          <w:kern w:val="0"/>
+          <w:sz w:val="20"/>
+          <w:szCs w:val="20"/>
+          <w:lang w:val="en-US" w:eastAsia="zh-CN" w:bidi="ar-SA"/>
+        </w:rPr>
+        <w:t>Video Link</w:t>
+      </w:r>
+      <w:r>
+        <w:rPr>
+          <w:rFonts w:hint="default" w:asciiTheme="minorHAnsi" w:hAnsiTheme="minorHAnsi" w:eastAsiaTheme="minorEastAsia" w:cstheme="minorBidi"/>
+          <w:kern w:val="0"/>
+          <w:sz w:val="20"/>
+          <w:szCs w:val="20"/>
+          <w:lang w:val="en-US" w:eastAsia="zh-CN" w:bidi="ar-SA"/>
+        </w:rPr>
+        <w:fldChar w:fldCharType="end"/>
+      </w:r>
+    </w:p>
+    <w:p>
+      <w:pPr>
+        <w:pStyle w:val="7"/>
+        <w:keepNext w:val="0"/>
+        <w:keepLines w:val="0"/>
+        <w:widowControl/>
+        <w:suppressLineNumbers w:val="0"/>
+        <w:spacing w:before="0" w:beforeAutospacing="0" w:after="0" w:afterAutospacing="0" w:line="240" w:lineRule="auto"/>
+        <w:rPr>
+          <w:rFonts w:hint="default" w:asciiTheme="minorHAnsi" w:hAnsiTheme="minorHAnsi" w:eastAsiaTheme="minorEastAsia" w:cstheme="minorBidi"/>
+          <w:kern w:val="0"/>
+          <w:sz w:val="20"/>
+          <w:szCs w:val="20"/>
+          <w:lang w:val="en-US" w:eastAsia="zh-CN" w:bidi="ar-SA"/>
+        </w:rPr>
+      </w:pPr>
+      <w:r>
+        <w:rPr>
+          <w:rFonts w:hint="default" w:asciiTheme="minorHAnsi" w:hAnsiTheme="minorHAnsi" w:eastAsiaTheme="minorEastAsia" w:cstheme="minorBidi"/>
+          <w:kern w:val="0"/>
+          <w:sz w:val="20"/>
+          <w:szCs w:val="20"/>
+          <w:lang w:val="en-US" w:eastAsia="zh-CN" w:bidi="ar-SA"/>
+        </w:rPr>
+        <w:t xml:space="preserve">- Coach Demo: </w:t>
+      </w:r>
+      <w:r>
+        <w:rPr>
+          <w:rFonts w:hint="default" w:asciiTheme="minorHAnsi" w:hAnsiTheme="minorHAnsi" w:eastAsiaTheme="minorEastAsia" w:cstheme="minorBidi"/>
+          <w:kern w:val="0"/>
+          <w:sz w:val="20"/>
+          <w:szCs w:val="20"/>
+          <w:lang w:val="en-US" w:eastAsia="zh-CN" w:bidi="ar-SA"/>
+        </w:rPr>
+        <w:fldChar w:fldCharType="begin"/>
+      </w:r>
+      <w:r>
+        <w:rPr>
+          <w:rFonts w:hint="default" w:asciiTheme="minorHAnsi" w:hAnsiTheme="minorHAnsi" w:eastAsiaTheme="minorEastAsia" w:cstheme="minorBidi"/>
+          <w:kern w:val="0"/>
+          <w:sz w:val="20"/>
+          <w:szCs w:val="20"/>
+          <w:lang w:val="en-US" w:eastAsia="zh-CN" w:bidi="ar-SA"/>
+        </w:rPr>
+        <w:instrText xml:space="preserve"> HYPERLINK "https://drive.google.com/file/d/1_kRmUInOOjvBU-wyT6hXBu6O71CFAQKH/view?usp=sharing" </w:instrText>
+      </w:r>
+      <w:r>
+        <w:rPr>
+          <w:rFonts w:hint="default" w:asciiTheme="minorHAnsi" w:hAnsiTheme="minorHAnsi" w:eastAsiaTheme="minorEastAsia" w:cstheme="minorBidi"/>
+          <w:kern w:val="0"/>
+          <w:sz w:val="20"/>
+          <w:szCs w:val="20"/>
+          <w:lang w:val="en-US" w:eastAsia="zh-CN" w:bidi="ar-SA"/>
+        </w:rPr>
+        <w:fldChar w:fldCharType="separate"/>
+      </w:r>
+      <w:r>
+        <w:rPr>
+          <w:rStyle w:val="5"/>
+          <w:rFonts w:hint="default" w:asciiTheme="minorHAnsi" w:hAnsiTheme="minorHAnsi" w:eastAsiaTheme="minorEastAsia" w:cstheme="minorBidi"/>
+          <w:kern w:val="0"/>
+          <w:sz w:val="20"/>
+          <w:szCs w:val="20"/>
+          <w:lang w:val="en-US" w:eastAsia="zh-CN" w:bidi="ar-SA"/>
+        </w:rPr>
+        <w:t>Video Link</w:t>
+      </w:r>
+      <w:r>
+        <w:rPr>
+          <w:rFonts w:hint="default" w:asciiTheme="minorHAnsi" w:hAnsiTheme="minorHAnsi" w:eastAsiaTheme="minorEastAsia" w:cstheme="minorBidi"/>
+          <w:kern w:val="0"/>
+          <w:sz w:val="20"/>
+          <w:szCs w:val="20"/>
+          <w:lang w:val="en-US" w:eastAsia="zh-CN" w:bidi="ar-SA"/>
+        </w:rPr>
+        <w:fldChar w:fldCharType="end"/>
+      </w:r>
+    </w:p>
+    <w:p>
+      <w:pPr>
+        <w:pStyle w:val="7"/>
+        <w:keepNext w:val="0"/>
+        <w:keepLines w:val="0"/>
+        <w:widowControl/>
+        <w:suppressLineNumbers w:val="0"/>
+        <w:spacing w:before="111" w:beforeLines="31" w:beforeAutospacing="0" w:after="0" w:afterAutospacing="0" w:line="240" w:lineRule="auto"/>
+        <w:rPr>
+          <w:rFonts w:hint="default" w:asciiTheme="minorHAnsi" w:hAnsiTheme="minorHAnsi" w:eastAsiaTheme="minorEastAsia" w:cstheme="minorBidi"/>
+          <w:b/>
+          <w:bCs/>
+          <w:kern w:val="0"/>
+          <w:sz w:val="20"/>
+          <w:szCs w:val="20"/>
+          <w:lang w:val="en-US" w:eastAsia="zh-CN" w:bidi="ar-SA"/>
+        </w:rPr>
+      </w:pPr>
+      <w:r>
+        <w:rPr>
+          <w:rFonts w:hint="default" w:asciiTheme="minorHAnsi" w:hAnsiTheme="minorHAnsi" w:eastAsiaTheme="minorEastAsia" w:cstheme="minorBidi"/>
+          <w:b/>
+          <w:bCs/>
+          <w:kern w:val="0"/>
+          <w:sz w:val="20"/>
+          <w:szCs w:val="20"/>
+          <w:lang w:val="en-US" w:eastAsia="zh-CN" w:bidi="ar-SA"/>
+        </w:rPr>
+        <w:t xml:space="preserve">Coupons App </w:t>
+      </w:r>
+      <w:r>
+        <w:rPr>
+          <w:rFonts w:hint="default" w:asciiTheme="minorHAnsi" w:hAnsiTheme="minorHAnsi" w:eastAsiaTheme="minorEastAsia" w:cstheme="minorBidi"/>
+          <w:b/>
+          <w:bCs/>
+          <w:kern w:val="0"/>
+          <w:sz w:val="20"/>
+          <w:szCs w:val="20"/>
+          <w:lang w:val="en-US" w:eastAsia="zh-CN" w:bidi="ar-SA"/>
         </w:rPr>
         <w:drawing>
-          <wp:inline distT="0" distB="0" distL="0" distR="0">
-            <wp:extent cx="64770" cy="64770"/>
-            <wp:effectExtent l="0" t="0" r="11430" b="11430"/>
-            <wp:docPr id="30" name="Image 30">
+          <wp:inline distT="0" distB="0" distL="114300" distR="114300">
+            <wp:extent cx="93345" cy="93345"/>
+            <wp:effectExtent l="0" t="0" r="1905" b="1905"/>
+            <wp:docPr id="1" name="Picture 1">
               <a:hlinkClick xmlns:a="http://schemas.openxmlformats.org/drawingml/2006/main" r:id="rId4"/>
             </wp:docPr>
-            <wp:cNvGraphicFramePr/>
+            <wp:cNvGraphicFramePr>
+              <a:graphicFrameLocks xmlns:a="http://schemas.openxmlformats.org/drawingml/2006/main" noChangeAspect="1"/>
+            </wp:cNvGraphicFramePr>
             <a:graphic xmlns:a="http://schemas.openxmlformats.org/drawingml/2006/main">
               <a:graphicData uri="http://schemas.openxmlformats.org/drawingml/2006/picture">
                 <pic:pic xmlns:pic="http://schemas.openxmlformats.org/drawingml/2006/picture">
                   <pic:nvPicPr>
-                    <pic:cNvPr id="30" name="Image 30"/>
-                    <pic:cNvPicPr/>
+                    <pic:cNvPr id="1" name="Picture 1"/>
+                    <pic:cNvPicPr>
+                      <a:picLocks noChangeAspect="1"/>
+                    </pic:cNvPicPr>
                   </pic:nvPicPr>
                   <pic:blipFill>
-                    <a:blip r:embed="rId5" cstate="print"/>
+                    <a:blip r:embed="rId5"/>
                     <a:stretch>
                       <a:fillRect/>
                     </a:stretch>
@@ -1593,11 +1751,15 @@
                   <pic:spPr>
                     <a:xfrm>
                       <a:off x="0" y="0"/>
-                      <a:ext cx="65360" cy="65360"/>
+                      <a:ext cx="93345" cy="93345"/>
                     </a:xfrm>
                     <a:prstGeom prst="rect">
                       <a:avLst/>
                     </a:prstGeom>
+                    <a:noFill/>
+                    <a:ln>
+                      <a:noFill/>
+                    </a:ln>
                   </pic:spPr>
                 </pic:pic>
               </a:graphicData>
@@ -1626,24 +1788,121 @@
         <w:widowControl/>
         <w:suppressLineNumbers w:val="0"/>
         <w:spacing w:before="0" w:beforeAutospacing="0" w:after="0" w:afterAutospacing="0" w:line="240" w:lineRule="auto"/>
-        <w:ind w:left="100" w:hanging="100" w:hangingChars="50"/>
-        <w:rPr>
-          <w:rFonts w:hint="default" w:asciiTheme="minorHAnsi" w:hAnsiTheme="minorHAnsi" w:eastAsiaTheme="minorEastAsia" w:cstheme="minorBidi"/>
-          <w:kern w:val="0"/>
-          <w:sz w:val="20"/>
-          <w:szCs w:val="20"/>
-          <w:lang w:val="en-US" w:eastAsia="zh-CN" w:bidi="ar-SA"/>
-        </w:rPr>
-      </w:pPr>
-      <w:r>
-        <w:rPr>
-          <w:rFonts w:hint="default" w:asciiTheme="minorHAnsi" w:hAnsiTheme="minorHAnsi" w:eastAsiaTheme="minorEastAsia" w:cstheme="minorBidi"/>
-          <w:kern w:val="0"/>
-          <w:sz w:val="20"/>
-          <w:szCs w:val="20"/>
-          <w:lang w:val="en-US" w:eastAsia="zh-CN" w:bidi="ar-SA"/>
-        </w:rPr>
-        <w:t>- Hotel booking platform that allows users to search for hotels, view room availability, and reserve rooms securely.</w:t>
+        <w:rPr>
+          <w:rFonts w:hint="default" w:asciiTheme="minorHAnsi" w:hAnsiTheme="minorHAnsi" w:eastAsiaTheme="minorEastAsia" w:cstheme="minorBidi"/>
+          <w:kern w:val="0"/>
+          <w:sz w:val="20"/>
+          <w:szCs w:val="20"/>
+          <w:lang w:val="en-US" w:eastAsia="zh-CN" w:bidi="ar-SA"/>
+        </w:rPr>
+      </w:pPr>
+      <w:r>
+        <w:rPr>
+          <w:rFonts w:hint="default" w:asciiTheme="minorHAnsi" w:hAnsiTheme="minorHAnsi" w:eastAsiaTheme="minorEastAsia" w:cstheme="minorBidi"/>
+          <w:kern w:val="0"/>
+          <w:sz w:val="20"/>
+          <w:szCs w:val="20"/>
+          <w:lang w:val="en-US" w:eastAsia="zh-CN" w:bidi="ar-SA"/>
+        </w:rPr>
+        <w:t>In this app you can find coupons for products in various sites.</w:t>
+      </w:r>
+    </w:p>
+    <w:p>
+      <w:pPr>
+        <w:pStyle w:val="7"/>
+        <w:keepNext w:val="0"/>
+        <w:keepLines w:val="0"/>
+        <w:widowControl/>
+        <w:suppressLineNumbers w:val="0"/>
+        <w:spacing w:before="110" w:beforeLines="30" w:beforeAutospacing="0" w:after="0" w:afterAutospacing="0" w:line="240" w:lineRule="auto"/>
+        <w:jc w:val="left"/>
+        <w:rPr>
+          <w:rFonts w:hint="default" w:asciiTheme="minorHAnsi" w:hAnsiTheme="minorHAnsi" w:eastAsiaTheme="minorEastAsia" w:cstheme="minorBidi"/>
+          <w:b/>
+          <w:bCs/>
+          <w:kern w:val="0"/>
+          <w:sz w:val="20"/>
+          <w:szCs w:val="20"/>
+          <w:lang w:val="en-US" w:eastAsia="zh-CN" w:bidi="ar-SA"/>
+        </w:rPr>
+      </w:pPr>
+      <w:r>
+        <w:rPr>
+          <w:rFonts w:hint="default" w:asciiTheme="minorHAnsi" w:hAnsiTheme="minorHAnsi" w:eastAsiaTheme="minorEastAsia" w:cstheme="minorBidi"/>
+          <w:b/>
+          <w:bCs/>
+          <w:kern w:val="0"/>
+          <w:sz w:val="20"/>
+          <w:szCs w:val="20"/>
+          <w:lang w:val="en-US" w:eastAsia="zh-CN" w:bidi="ar-SA"/>
+        </w:rPr>
+        <w:t xml:space="preserve">Alain Factory For Healthy Water </w:t>
+      </w:r>
+      <w:r>
+        <w:rPr>
+          <w:rFonts w:hint="default" w:asciiTheme="minorHAnsi" w:hAnsiTheme="minorHAnsi" w:eastAsiaTheme="minorEastAsia" w:cstheme="minorBidi"/>
+          <w:b/>
+          <w:bCs/>
+          <w:kern w:val="0"/>
+          <w:sz w:val="20"/>
+          <w:szCs w:val="20"/>
+          <w:lang w:val="en-US" w:eastAsia="zh-CN" w:bidi="ar-SA"/>
+        </w:rPr>
+        <w:drawing>
+          <wp:inline distT="0" distB="0" distL="114300" distR="114300">
+            <wp:extent cx="93345" cy="93345"/>
+            <wp:effectExtent l="0" t="0" r="1905" b="1905"/>
+            <wp:docPr id="2" name="Picture 2">
+              <a:hlinkClick xmlns:a="http://schemas.openxmlformats.org/drawingml/2006/main" r:id="rId6"/>
+            </wp:docPr>
+            <wp:cNvGraphicFramePr>
+              <a:graphicFrameLocks xmlns:a="http://schemas.openxmlformats.org/drawingml/2006/main" noChangeAspect="1"/>
+            </wp:cNvGraphicFramePr>
+            <a:graphic xmlns:a="http://schemas.openxmlformats.org/drawingml/2006/main">
+              <a:graphicData uri="http://schemas.openxmlformats.org/drawingml/2006/picture">
+                <pic:pic xmlns:pic="http://schemas.openxmlformats.org/drawingml/2006/picture">
+                  <pic:nvPicPr>
+                    <pic:cNvPr id="2" name="Picture 2"/>
+                    <pic:cNvPicPr>
+                      <a:picLocks noChangeAspect="1"/>
+                    </pic:cNvPicPr>
+                  </pic:nvPicPr>
+                  <pic:blipFill>
+                    <a:blip r:embed="rId5"/>
+                    <a:stretch>
+                      <a:fillRect/>
+                    </a:stretch>
+                  </pic:blipFill>
+                  <pic:spPr>
+                    <a:xfrm>
+                      <a:off x="0" y="0"/>
+                      <a:ext cx="93345" cy="93345"/>
+                    </a:xfrm>
+                    <a:prstGeom prst="rect">
+                      <a:avLst/>
+                    </a:prstGeom>
+                    <a:noFill/>
+                    <a:ln>
+                      <a:noFill/>
+                    </a:ln>
+                  </pic:spPr>
+                </pic:pic>
+              </a:graphicData>
+            </a:graphic>
+          </wp:inline>
+        </w:drawing>
+      </w:r>
+      <w:r>
+        <w:rPr>
+          <w:rFonts w:hint="default" w:asciiTheme="minorHAnsi" w:hAnsiTheme="minorHAnsi" w:eastAsiaTheme="minorEastAsia" w:cstheme="minorBidi"/>
+          <w:b/>
+          <w:bCs/>
+          <w:kern w:val="0"/>
+          <w:sz w:val="20"/>
+          <w:szCs w:val="20"/>
+          <w:lang w:val="en-US" w:eastAsia="zh-CN" w:bidi="ar-SA"/>
+        </w:rPr>
+        <w:t>:</w:t>
       </w:r>
     </w:p>
     <w:p>
@@ -1670,7 +1929,105 @@
           <w:szCs w:val="20"/>
           <w:lang w:val="en-US" w:eastAsia="zh-CN" w:bidi="ar-SA"/>
         </w:rPr>
-        <w:t>- It’s designed to power both web and mobile clients, handling everything from user authentication to booking management.</w:t>
+        <w:t>Magic Eye Water is the main water company in Iraq, which distributes throughout Iraq.</w:t>
+      </w:r>
+    </w:p>
+    <w:p>
+      <w:pPr>
+        <w:pStyle w:val="7"/>
+        <w:keepNext w:val="0"/>
+        <w:keepLines w:val="0"/>
+        <w:widowControl/>
+        <w:suppressLineNumbers w:val="0"/>
+        <w:spacing w:before="111" w:beforeLines="31" w:beforeAutospacing="0" w:after="0" w:afterAutospacing="0" w:line="240" w:lineRule="auto"/>
+        <w:jc w:val="left"/>
+        <w:rPr>
+          <w:rFonts w:hint="default" w:asciiTheme="minorHAnsi" w:hAnsiTheme="minorHAnsi" w:eastAsiaTheme="minorEastAsia" w:cstheme="minorBidi"/>
+          <w:b/>
+          <w:bCs/>
+          <w:kern w:val="0"/>
+          <w:sz w:val="20"/>
+          <w:szCs w:val="20"/>
+          <w:lang w:val="en-US" w:eastAsia="zh-CN" w:bidi="ar-SA"/>
+        </w:rPr>
+      </w:pPr>
+      <w:r>
+        <w:rPr>
+          <w:rFonts w:hint="default" w:asciiTheme="minorHAnsi" w:hAnsiTheme="minorHAnsi" w:eastAsiaTheme="minorEastAsia" w:cstheme="minorBidi"/>
+          <w:b/>
+          <w:bCs/>
+          <w:kern w:val="0"/>
+          <w:sz w:val="20"/>
+          <w:szCs w:val="20"/>
+          <w:lang w:val="en-US" w:eastAsia="zh-CN" w:bidi="ar-SA"/>
+        </w:rPr>
+        <w:t xml:space="preserve">Hotel Booking </w:t>
+      </w:r>
+      <w:r>
+        <w:rPr>
+          <w:rFonts w:hint="default" w:asciiTheme="minorHAnsi" w:hAnsiTheme="minorHAnsi" w:eastAsiaTheme="minorEastAsia" w:cstheme="minorBidi"/>
+          <w:b/>
+          <w:bCs/>
+          <w:kern w:val="0"/>
+          <w:sz w:val="20"/>
+          <w:szCs w:val="20"/>
+          <w:lang w:val="en-US" w:eastAsia="zh-CN" w:bidi="ar-SA"/>
+        </w:rPr>
+        <w:drawing>
+          <wp:inline distT="0" distB="0" distL="114300" distR="114300">
+            <wp:extent cx="93345" cy="93345"/>
+            <wp:effectExtent l="0" t="0" r="1905" b="1905"/>
+            <wp:docPr id="3" name="Picture 3">
+              <a:hlinkClick xmlns:a="http://schemas.openxmlformats.org/drawingml/2006/main" r:id="rId7"/>
+            </wp:docPr>
+            <wp:cNvGraphicFramePr>
+              <a:graphicFrameLocks xmlns:a="http://schemas.openxmlformats.org/drawingml/2006/main" noChangeAspect="1"/>
+            </wp:cNvGraphicFramePr>
+            <a:graphic xmlns:a="http://schemas.openxmlformats.org/drawingml/2006/main">
+              <a:graphicData uri="http://schemas.openxmlformats.org/drawingml/2006/picture">
+                <pic:pic xmlns:pic="http://schemas.openxmlformats.org/drawingml/2006/picture">
+                  <pic:nvPicPr>
+                    <pic:cNvPr id="3" name="Picture 3"/>
+                    <pic:cNvPicPr>
+                      <a:picLocks noChangeAspect="1"/>
+                    </pic:cNvPicPr>
+                  </pic:nvPicPr>
+                  <pic:blipFill>
+                    <a:blip r:embed="rId5"/>
+                    <a:stretch>
+                      <a:fillRect/>
+                    </a:stretch>
+                  </pic:blipFill>
+                  <pic:spPr>
+                    <a:xfrm>
+                      <a:off x="0" y="0"/>
+                      <a:ext cx="93345" cy="93345"/>
+                    </a:xfrm>
+                    <a:prstGeom prst="rect">
+                      <a:avLst/>
+                    </a:prstGeom>
+                    <a:noFill/>
+                    <a:ln>
+                      <a:noFill/>
+                    </a:ln>
+                  </pic:spPr>
+                </pic:pic>
+              </a:graphicData>
+            </a:graphic>
+          </wp:inline>
+        </w:drawing>
+      </w:r>
+      <w:r>
+        <w:rPr>
+          <w:rFonts w:hint="default" w:asciiTheme="minorHAnsi" w:hAnsiTheme="minorHAnsi" w:eastAsiaTheme="minorEastAsia" w:cstheme="minorBidi"/>
+          <w:b/>
+          <w:bCs/>
+          <w:kern w:val="0"/>
+          <w:sz w:val="20"/>
+          <w:szCs w:val="20"/>
+          <w:lang w:val="en-US" w:eastAsia="zh-CN" w:bidi="ar-SA"/>
+        </w:rPr>
+        <w:t>:</w:t>
       </w:r>
     </w:p>
     <w:p>
@@ -1681,34 +2038,23 @@
         <w:widowControl/>
         <w:suppressLineNumbers w:val="0"/>
         <w:spacing w:before="0" w:beforeAutospacing="0" w:after="0" w:afterAutospacing="0" w:line="240" w:lineRule="auto"/>
-        <w:jc w:val="left"/>
-        <w:rPr>
-          <w:rFonts w:hint="default" w:asciiTheme="minorHAnsi" w:hAnsiTheme="minorHAnsi" w:eastAsiaTheme="minorEastAsia" w:cstheme="minorBidi"/>
-          <w:kern w:val="0"/>
-          <w:sz w:val="20"/>
-          <w:szCs w:val="20"/>
-          <w:lang w:val="en-US" w:eastAsia="zh-CN" w:bidi="ar-SA"/>
-        </w:rPr>
-      </w:pPr>
-      <w:r>
-        <w:rPr>
-          <w:rFonts w:hint="default" w:asciiTheme="minorHAnsi" w:hAnsiTheme="minorHAnsi" w:eastAsiaTheme="minorEastAsia" w:cstheme="minorBidi"/>
-          <w:kern w:val="0"/>
-          <w:sz w:val="20"/>
-          <w:szCs w:val="20"/>
-          <w:lang w:val="en-US" w:eastAsia="zh-CN" w:bidi="ar-SA"/>
-        </w:rPr>
-        <w:t xml:space="preserve">- </w:t>
-      </w:r>
-      <w:r>
-        <w:rPr>
-          <w:rFonts w:hint="eastAsia" w:asciiTheme="minorHAnsi" w:hAnsiTheme="minorHAnsi" w:eastAsiaTheme="minorEastAsia" w:cstheme="minorBidi"/>
-          <w:kern w:val="0"/>
-          <w:sz w:val="20"/>
-          <w:szCs w:val="20"/>
-          <w:lang w:val="en-US" w:eastAsia="zh-CN" w:bidi="ar-SA"/>
-        </w:rPr>
-        <w:t>Tech: Node.js, Express.js, MongoDB, JWT, bcrypt, RESTful API Design.</w:t>
+        <w:rPr>
+          <w:rFonts w:hint="default" w:asciiTheme="minorHAnsi" w:hAnsiTheme="minorHAnsi" w:eastAsiaTheme="minorEastAsia" w:cstheme="minorBidi"/>
+          <w:kern w:val="0"/>
+          <w:sz w:val="20"/>
+          <w:szCs w:val="20"/>
+          <w:lang w:val="en-US" w:eastAsia="zh-CN" w:bidi="ar-SA"/>
+        </w:rPr>
+      </w:pPr>
+      <w:r>
+        <w:rPr>
+          <w:rFonts w:hint="default" w:asciiTheme="minorHAnsi" w:hAnsiTheme="minorHAnsi" w:eastAsiaTheme="minorEastAsia" w:cstheme="minorBidi"/>
+          <w:kern w:val="0"/>
+          <w:sz w:val="20"/>
+          <w:szCs w:val="20"/>
+          <w:lang w:val="en-US" w:eastAsia="zh-CN" w:bidi="ar-SA"/>
+        </w:rPr>
+        <w:t>This app helps you find the best hotel that fits your needs.</w:t>
       </w:r>
     </w:p>
     <w:p>
@@ -1719,7 +2065,6 @@
         <w:widowControl/>
         <w:suppressLineNumbers w:val="0"/>
         <w:spacing w:before="0" w:beforeAutospacing="0" w:after="0" w:afterAutospacing="0" w:line="240" w:lineRule="auto"/>
-        <w:jc w:val="left"/>
         <w:rPr>
           <w:rFonts w:hint="default" w:asciiTheme="minorHAnsi" w:hAnsiTheme="minorHAnsi" w:eastAsiaTheme="minorEastAsia" w:cstheme="minorBidi"/>
           <w:kern w:val="0"/>
@@ -1793,17 +2138,17 @@
           <w:szCs w:val="20"/>
           <w:lang w:val="en-US" w:eastAsia="zh-CN" w:bidi="ar-SA"/>
         </w:rPr>
-        <w:t>Programming</w:t>
-      </w:r>
-      <w:r>
-        <w:rPr>
-          <w:rFonts w:hint="default" w:asciiTheme="minorHAnsi" w:hAnsiTheme="minorHAnsi" w:eastAsiaTheme="minorEastAsia" w:cstheme="minorBidi"/>
-          <w:kern w:val="0"/>
-          <w:sz w:val="20"/>
-          <w:szCs w:val="20"/>
-          <w:lang w:val="en-US" w:eastAsia="zh-CN" w:bidi="ar-SA"/>
-        </w:rPr>
-        <w:t>: Dart, JavaScript, TypeScript, C#, Python</w:t>
+        <w:t>Flutter and Mobile Development</w:t>
+      </w:r>
+      <w:r>
+        <w:rPr>
+          <w:rFonts w:hint="default" w:asciiTheme="minorHAnsi" w:hAnsiTheme="minorHAnsi" w:eastAsiaTheme="minorEastAsia" w:cstheme="minorBidi"/>
+          <w:kern w:val="0"/>
+          <w:sz w:val="20"/>
+          <w:szCs w:val="20"/>
+          <w:lang w:val="en-US" w:eastAsia="zh-CN" w:bidi="ar-SA"/>
+        </w:rPr>
+        <w:t>: Flutter, Dart, BLOC, Riverpod, Redux.</w:t>
       </w:r>
     </w:p>
     <w:p>
@@ -1842,17 +2187,17 @@
           <w:szCs w:val="20"/>
           <w:lang w:val="en-US" w:eastAsia="zh-CN" w:bidi="ar-SA"/>
         </w:rPr>
-        <w:t>Backend</w:t>
-      </w:r>
-      <w:r>
-        <w:rPr>
-          <w:rFonts w:hint="default" w:asciiTheme="minorHAnsi" w:hAnsiTheme="minorHAnsi" w:eastAsiaTheme="minorEastAsia" w:cstheme="minorBidi"/>
-          <w:kern w:val="0"/>
-          <w:sz w:val="20"/>
-          <w:szCs w:val="20"/>
-          <w:lang w:val="en-US" w:eastAsia="zh-CN" w:bidi="ar-SA"/>
-        </w:rPr>
-        <w:t>: Nodejs, Express.js</w:t>
+        <w:t>Backend and Web Development</w:t>
+      </w:r>
+      <w:r>
+        <w:rPr>
+          <w:rFonts w:hint="default" w:asciiTheme="minorHAnsi" w:hAnsiTheme="minorHAnsi" w:eastAsiaTheme="minorEastAsia" w:cstheme="minorBidi"/>
+          <w:kern w:val="0"/>
+          <w:sz w:val="20"/>
+          <w:szCs w:val="20"/>
+          <w:lang w:val="en-US" w:eastAsia="zh-CN" w:bidi="ar-SA"/>
+        </w:rPr>
+        <w:t>: Nodejs, Express.js, TypeScript, JavaScript, MongoDB.</w:t>
       </w:r>
     </w:p>
     <w:p>
@@ -1891,17 +2236,17 @@
           <w:szCs w:val="20"/>
           <w:lang w:val="en-US" w:eastAsia="zh-CN" w:bidi="ar-SA"/>
         </w:rPr>
-        <w:t>Frontend</w:t>
-      </w:r>
-      <w:r>
-        <w:rPr>
-          <w:rFonts w:hint="default" w:asciiTheme="minorHAnsi" w:hAnsiTheme="minorHAnsi" w:eastAsiaTheme="minorEastAsia" w:cstheme="minorBidi"/>
-          <w:kern w:val="0"/>
-          <w:sz w:val="20"/>
-          <w:szCs w:val="20"/>
-          <w:lang w:val="en-US" w:eastAsia="zh-CN" w:bidi="ar-SA"/>
-        </w:rPr>
-        <w:t>: HTML, CSS, React, Bootstrap, Angular</w:t>
+        <w:t>Frontend (Web)</w:t>
+      </w:r>
+      <w:r>
+        <w:rPr>
+          <w:rFonts w:hint="default" w:asciiTheme="minorHAnsi" w:hAnsiTheme="minorHAnsi" w:eastAsiaTheme="minorEastAsia" w:cstheme="minorBidi"/>
+          <w:kern w:val="0"/>
+          <w:sz w:val="20"/>
+          <w:szCs w:val="20"/>
+          <w:lang w:val="en-US" w:eastAsia="zh-CN" w:bidi="ar-SA"/>
+        </w:rPr>
+        <w:t>: HTML, CSS, React, Angular, Bootstrap, Tailwind.</w:t>
       </w:r>
     </w:p>
     <w:p>
@@ -1940,17 +2285,17 @@
           <w:szCs w:val="20"/>
           <w:lang w:val="en-US" w:eastAsia="zh-CN" w:bidi="ar-SA"/>
         </w:rPr>
-        <w:t>Database</w:t>
-      </w:r>
-      <w:r>
-        <w:rPr>
-          <w:rFonts w:hint="default" w:asciiTheme="minorHAnsi" w:hAnsiTheme="minorHAnsi" w:eastAsiaTheme="minorEastAsia" w:cstheme="minorBidi"/>
-          <w:kern w:val="0"/>
-          <w:sz w:val="20"/>
-          <w:szCs w:val="20"/>
-          <w:lang w:val="en-US" w:eastAsia="zh-CN" w:bidi="ar-SA"/>
-        </w:rPr>
-        <w:t>: MongoDB, SQLite</w:t>
+        <w:t>Tools</w:t>
+      </w:r>
+      <w:r>
+        <w:rPr>
+          <w:rFonts w:hint="default" w:asciiTheme="minorHAnsi" w:hAnsiTheme="minorHAnsi" w:eastAsiaTheme="minorEastAsia" w:cstheme="minorBidi"/>
+          <w:kern w:val="0"/>
+          <w:sz w:val="20"/>
+          <w:szCs w:val="20"/>
+          <w:lang w:val="en-US" w:eastAsia="zh-CN" w:bidi="ar-SA"/>
+        </w:rPr>
+        <w:t>: Git, Github, Github Actions, Firebase, Postman, Figma.</w:t>
       </w:r>
     </w:p>
     <w:p>
@@ -1989,55 +2334,6 @@
           <w:szCs w:val="20"/>
           <w:lang w:val="en-US" w:eastAsia="zh-CN" w:bidi="ar-SA"/>
         </w:rPr>
-        <w:t>Tools</w:t>
-      </w:r>
-      <w:r>
-        <w:rPr>
-          <w:rFonts w:hint="default" w:asciiTheme="minorHAnsi" w:hAnsiTheme="minorHAnsi" w:eastAsiaTheme="minorEastAsia" w:cstheme="minorBidi"/>
-          <w:kern w:val="0"/>
-          <w:sz w:val="20"/>
-          <w:szCs w:val="20"/>
-          <w:lang w:val="en-US" w:eastAsia="zh-CN" w:bidi="ar-SA"/>
-        </w:rPr>
-        <w:t>: Git, Github, Github Actions, Firebase</w:t>
-      </w:r>
-    </w:p>
-    <w:p>
-      <w:pPr>
-        <w:pStyle w:val="7"/>
-        <w:keepNext w:val="0"/>
-        <w:keepLines w:val="0"/>
-        <w:widowControl/>
-        <w:suppressLineNumbers w:val="0"/>
-        <w:spacing w:before="0" w:beforeAutospacing="0" w:after="0" w:afterAutospacing="0" w:line="240" w:lineRule="auto"/>
-        <w:rPr>
-          <w:rFonts w:hint="default" w:asciiTheme="minorHAnsi" w:hAnsiTheme="minorHAnsi" w:eastAsiaTheme="minorEastAsia" w:cstheme="minorBidi"/>
-          <w:kern w:val="0"/>
-          <w:sz w:val="20"/>
-          <w:szCs w:val="20"/>
-          <w:lang w:val="en-US" w:eastAsia="zh-CN" w:bidi="ar-SA"/>
-        </w:rPr>
-      </w:pPr>
-      <w:r>
-        <w:rPr>
-          <w:rFonts w:hint="default" w:asciiTheme="minorHAnsi" w:hAnsiTheme="minorHAnsi" w:eastAsiaTheme="minorEastAsia" w:cstheme="minorBidi"/>
-          <w:kern w:val="0"/>
-          <w:sz w:val="20"/>
-          <w:szCs w:val="20"/>
-          <w:lang w:val="en-US" w:eastAsia="zh-CN" w:bidi="ar-SA"/>
-        </w:rPr>
-        <w:t xml:space="preserve">- </w:t>
-      </w:r>
-      <w:r>
-        <w:rPr>
-          <w:rFonts w:hint="default" w:asciiTheme="minorHAnsi" w:hAnsiTheme="minorHAnsi" w:eastAsiaTheme="minorEastAsia" w:cstheme="minorBidi"/>
-          <w:b/>
-          <w:bCs/>
-          <w:kern w:val="0"/>
-          <w:sz w:val="20"/>
-          <w:szCs w:val="20"/>
-          <w:lang w:val="en-US" w:eastAsia="zh-CN" w:bidi="ar-SA"/>
-        </w:rPr>
         <w:t>Concepts</w:t>
       </w:r>
       <w:r>
@@ -2048,7 +2344,7 @@
           <w:szCs w:val="20"/>
           <w:lang w:val="en-US" w:eastAsia="zh-CN" w:bidi="ar-SA"/>
         </w:rPr>
-        <w:t>: OOP, Data Structures, Algorithms, Design Patterns, OS, Computer Networking, Agile Development</w:t>
+        <w:t>: OOP, Data Structures, Algorithms, Design Patterns, OS, Computer Networking, Agile Development.</w:t>
       </w:r>
     </w:p>
     <w:sectPr>

</xml_diff>